<commit_message>
Add system_preflight_check.py — prevent breakage before/after changes
Checks 19 critical systems:
- Finviz: cookie exists, has auth tokens, CSV download works, returns tickers
- Ollama: qwen3:1.7b responds
- Portfolio server: 3 key API endpoints
- Database: table count, news articles, agent results
- Systemd services: tradeai-continuous active
- State files: holdings, enrichment, dividend freshness (<24h)
- Screener config: URLs use /export not .ashx

Usage:
  python3 scripts/system_preflight_check.py
  (run BEFORE and AFTER any code changes)

Current result: 18/19 PASS (portfolio-server not a systemd service)

Root cause analysis of today's issues:
- Finviz URL change (external) — now detected by screener config check
- Missing .env sourcing (pre-existing) — now detected by cookie check
- Wrong ollama model (pre-existing) — now detected by ollama check
- None caused by yesterday's code changes

Co-Authored-By: Claude Opus 4.6 (1M context) <noreply@anthropic.com>
</commit_message>
<xml_diff>
--- a/reports/2026-04-29/0700/trade_ai_2026-04-29_0700.docx
+++ b/reports/2026-04-29/0700/trade_ai_2026-04-29_0700.docx
@@ -19,7 +19,7 @@
         <w:rPr>
           <w:sz w:val="20"/>
         </w:rPr>
-        <w:t>Run Window: 0700  ·  Date: 2026-04-29  ·  Generated: 08:06:19 ET</w:t>
+        <w:t>Run Window: 0700  ·  Date: 2026-04-29  ·  Generated: 08:14:50 ET</w:t>
       </w:r>
     </w:p>
     <w:p>
@@ -202,7 +202,7 @@
           </w:tcPr>
           <w:p>
             <w:r>
-              <w:t>0</w:t>
+              <w:t>6</w:t>
             </w:r>
           </w:p>
         </w:tc>
@@ -224,7 +224,7 @@
           </w:tcPr>
           <w:p>
             <w:r>
-              <w:t>0</w:t>
+              <w:t>1</w:t>
             </w:r>
           </w:p>
         </w:tc>
@@ -246,7 +246,7 @@
           </w:tcPr>
           <w:p>
             <w:r>
-              <w:t>0</w:t>
+              <w:t>4</w:t>
             </w:r>
           </w:p>
         </w:tc>
@@ -268,7 +268,7 @@
           </w:tcPr>
           <w:p>
             <w:r>
-              <w:t>0</w:t>
+              <w:t>5</w:t>
             </w:r>
           </w:p>
         </w:tc>
@@ -290,7 +290,7 @@
           </w:tcPr>
           <w:p>
             <w:r>
-              <w:t>0</w:t>
+              <w:t>7</w:t>
             </w:r>
           </w:p>
         </w:tc>
@@ -312,7 +312,7 @@
           </w:tcPr>
           <w:p>
             <w:r>
-              <w:t>—</w:t>
+              <w:t>42 (KALV)</w:t>
             </w:r>
           </w:p>
         </w:tc>
@@ -329,8 +329,80 @@
       <w:bookmarkEnd w:id="3"/>
     </w:p>
     <w:p>
+      <w:pPr>
+        <w:spacing w:after="20"/>
+      </w:pPr>
       <w:r>
-        <w:t>No delta events — this is the first run or state is empty.</w:t>
+        <w:rPr>
+          <w:sz w:val="19"/>
+        </w:rPr>
+        <w:t>🆕 NEW  KALV  —  Score: 42  ·  GO</w:t>
+      </w:r>
+    </w:p>
+    <w:p>
+      <w:pPr>
+        <w:spacing w:after="20"/>
+      </w:pPr>
+      <w:r>
+        <w:rPr>
+          <w:sz w:val="19"/>
+        </w:rPr>
+        <w:t>🆕 NEW  ATLN  —  Score: 34  ·  WAIT</w:t>
+      </w:r>
+    </w:p>
+    <w:p>
+      <w:pPr>
+        <w:spacing w:after="20"/>
+      </w:pPr>
+      <w:r>
+        <w:rPr>
+          <w:sz w:val="19"/>
+        </w:rPr>
+        <w:t>🆕 NEW  GCTK  —  Score: 34  ·  WAIT</w:t>
+      </w:r>
+    </w:p>
+    <w:p>
+      <w:pPr>
+        <w:spacing w:after="20"/>
+      </w:pPr>
+      <w:r>
+        <w:rPr>
+          <w:sz w:val="19"/>
+        </w:rPr>
+        <w:t>🆕 NEW  AKAN  —  Score: 33  ·  WAIT</w:t>
+      </w:r>
+    </w:p>
+    <w:p>
+      <w:pPr>
+        <w:spacing w:after="20"/>
+      </w:pPr>
+      <w:r>
+        <w:rPr>
+          <w:sz w:val="19"/>
+        </w:rPr>
+        <w:t>🆕 NEW  WALD  —  Score: 33  ·  WAIT</w:t>
+      </w:r>
+    </w:p>
+    <w:p>
+      <w:pPr>
+        <w:spacing w:after="20"/>
+      </w:pPr>
+      <w:r>
+        <w:rPr>
+          <w:sz w:val="19"/>
+        </w:rPr>
+        <w:t>📈 UP   TRAW  —  20 → 29 (+9)</w:t>
+      </w:r>
+    </w:p>
+    <w:p>
+      <w:pPr>
+        <w:spacing w:after="20"/>
+      </w:pPr>
+      <w:r>
+        <w:rPr>
+          <w:sz w:val="19"/>
+        </w:rPr>
+        <w:t>✅ CRIT TRAW  —  change_above_10pct</w:t>
       </w:r>
     </w:p>
     <w:p>
@@ -513,6 +585,810 @@
           </w:p>
         </w:tc>
       </w:tr>
+      <w:tr>
+        <w:tc>
+          <w:tcPr>
+            <w:tcW w:type="dxa" w:w="1008"/>
+          </w:tcPr>
+          <w:p>
+            <w:r>
+              <w:rPr>
+                <w:sz w:val="17"/>
+              </w:rPr>
+              <w:t>KALV</w:t>
+            </w:r>
+          </w:p>
+        </w:tc>
+        <w:tc>
+          <w:tcPr>
+            <w:tcW w:type="dxa" w:w="1008"/>
+          </w:tcPr>
+          <w:p>
+            <w:r>
+              <w:rPr>
+                <w:sz w:val="17"/>
+              </w:rPr>
+              <w:t>42</w:t>
+            </w:r>
+          </w:p>
+        </w:tc>
+        <w:tc>
+          <w:tcPr>
+            <w:tcW w:type="dxa" w:w="1008"/>
+          </w:tcPr>
+          <w:p>
+            <w:r>
+              <w:rPr>
+                <w:sz w:val="17"/>
+              </w:rPr>
+              <w:t>A</w:t>
+            </w:r>
+          </w:p>
+        </w:tc>
+        <w:tc>
+          <w:tcPr>
+            <w:tcW w:type="dxa" w:w="1008"/>
+          </w:tcPr>
+          <w:p>
+            <w:r>
+              <w:rPr>
+                <w:b/>
+                <w:color w:val="0F9D58"/>
+                <w:sz w:val="17"/>
+              </w:rPr>
+              <w:t>GO</w:t>
+            </w:r>
+          </w:p>
+        </w:tc>
+        <w:tc>
+          <w:tcPr>
+            <w:tcW w:type="dxa" w:w="1008"/>
+          </w:tcPr>
+          <w:p>
+            <w:r>
+              <w:rPr>
+                <w:sz w:val="17"/>
+              </w:rPr>
+              <w:t>6.4x</w:t>
+            </w:r>
+          </w:p>
+        </w:tc>
+        <w:tc>
+          <w:tcPr>
+            <w:tcW w:type="dxa" w:w="1008"/>
+          </w:tcPr>
+          <w:p>
+            <w:r>
+              <w:rPr>
+                <w:sz w:val="17"/>
+              </w:rPr>
+              <w:t>$26.71</w:t>
+            </w:r>
+          </w:p>
+        </w:tc>
+        <w:tc>
+          <w:tcPr>
+            <w:tcW w:type="dxa" w:w="1008"/>
+          </w:tcPr>
+          <w:p>
+            <w:r>
+              <w:rPr>
+                <w:sz w:val="17"/>
+              </w:rPr>
+              <w:t>+38.8%</w:t>
+            </w:r>
+          </w:p>
+        </w:tc>
+        <w:tc>
+          <w:tcPr>
+            <w:tcW w:type="dxa" w:w="1008"/>
+          </w:tcPr>
+          <w:p>
+            <w:r>
+              <w:rPr>
+                <w:sz w:val="17"/>
+              </w:rPr>
+              <w:t>+38.1%</w:t>
+            </w:r>
+          </w:p>
+        </w:tc>
+        <w:tc>
+          <w:tcPr>
+            <w:tcW w:type="dxa" w:w="1008"/>
+          </w:tcPr>
+          <w:p>
+            <w:r>
+              <w:rPr>
+                <w:sz w:val="17"/>
+              </w:rPr>
+              <w:t>37.9M</w:t>
+            </w:r>
+          </w:p>
+        </w:tc>
+        <w:tc>
+          <w:tcPr>
+            <w:tcW w:type="dxa" w:w="1008"/>
+          </w:tcPr>
+          <w:p>
+            <w:r>
+              <w:rPr>
+                <w:sz w:val="17"/>
+              </w:rPr>
+              <w:t>Top Premarket Gainers</w:t>
+            </w:r>
+          </w:p>
+        </w:tc>
+      </w:tr>
+      <w:tr>
+        <w:tc>
+          <w:tcPr>
+            <w:tcW w:type="dxa" w:w="1008"/>
+          </w:tcPr>
+          <w:p>
+            <w:r>
+              <w:rPr>
+                <w:sz w:val="17"/>
+              </w:rPr>
+              <w:t>ATLN</w:t>
+            </w:r>
+          </w:p>
+        </w:tc>
+        <w:tc>
+          <w:tcPr>
+            <w:tcW w:type="dxa" w:w="1008"/>
+          </w:tcPr>
+          <w:p>
+            <w:r>
+              <w:rPr>
+                <w:sz w:val="17"/>
+              </w:rPr>
+              <w:t>34</w:t>
+            </w:r>
+          </w:p>
+        </w:tc>
+        <w:tc>
+          <w:tcPr>
+            <w:tcW w:type="dxa" w:w="1008"/>
+          </w:tcPr>
+          <w:p>
+            <w:r>
+              <w:rPr>
+                <w:sz w:val="17"/>
+              </w:rPr>
+              <w:t>B</w:t>
+            </w:r>
+          </w:p>
+        </w:tc>
+        <w:tc>
+          <w:tcPr>
+            <w:tcW w:type="dxa" w:w="1008"/>
+          </w:tcPr>
+          <w:p>
+            <w:r>
+              <w:rPr>
+                <w:b/>
+                <w:color w:val="F4B400"/>
+                <w:sz w:val="17"/>
+              </w:rPr>
+              <w:t>WAIT</w:t>
+            </w:r>
+          </w:p>
+        </w:tc>
+        <w:tc>
+          <w:tcPr>
+            <w:tcW w:type="dxa" w:w="1008"/>
+          </w:tcPr>
+          <w:p>
+            <w:r>
+              <w:rPr>
+                <w:sz w:val="17"/>
+              </w:rPr>
+              <w:t>14.8x</w:t>
+            </w:r>
+          </w:p>
+        </w:tc>
+        <w:tc>
+          <w:tcPr>
+            <w:tcW w:type="dxa" w:w="1008"/>
+          </w:tcPr>
+          <w:p>
+            <w:r>
+              <w:rPr>
+                <w:sz w:val="17"/>
+              </w:rPr>
+              <w:t>$2.25</w:t>
+            </w:r>
+          </w:p>
+        </w:tc>
+        <w:tc>
+          <w:tcPr>
+            <w:tcW w:type="dxa" w:w="1008"/>
+          </w:tcPr>
+          <w:p>
+            <w:r>
+              <w:rPr>
+                <w:sz w:val="17"/>
+              </w:rPr>
+              <w:t>+8.2%</w:t>
+            </w:r>
+          </w:p>
+        </w:tc>
+        <w:tc>
+          <w:tcPr>
+            <w:tcW w:type="dxa" w:w="1008"/>
+          </w:tcPr>
+          <w:p>
+            <w:r>
+              <w:rPr>
+                <w:sz w:val="17"/>
+              </w:rPr>
+              <w:t>+7.5%</w:t>
+            </w:r>
+          </w:p>
+        </w:tc>
+        <w:tc>
+          <w:tcPr>
+            <w:tcW w:type="dxa" w:w="1008"/>
+          </w:tcPr>
+          <w:p>
+            <w:r>
+              <w:rPr>
+                <w:sz w:val="17"/>
+              </w:rPr>
+              <w:t>11.0M</w:t>
+            </w:r>
+          </w:p>
+        </w:tc>
+        <w:tc>
+          <w:tcPr>
+            <w:tcW w:type="dxa" w:w="1008"/>
+          </w:tcPr>
+          <w:p>
+            <w:r>
+              <w:rPr>
+                <w:sz w:val="17"/>
+              </w:rPr>
+              <w:t>Get insights into the top gainers and losers of Tu</w:t>
+            </w:r>
+          </w:p>
+        </w:tc>
+      </w:tr>
+      <w:tr>
+        <w:tc>
+          <w:tcPr>
+            <w:tcW w:type="dxa" w:w="1008"/>
+          </w:tcPr>
+          <w:p>
+            <w:r>
+              <w:rPr>
+                <w:sz w:val="17"/>
+              </w:rPr>
+              <w:t>GCTK</w:t>
+            </w:r>
+          </w:p>
+        </w:tc>
+        <w:tc>
+          <w:tcPr>
+            <w:tcW w:type="dxa" w:w="1008"/>
+          </w:tcPr>
+          <w:p>
+            <w:r>
+              <w:rPr>
+                <w:sz w:val="17"/>
+              </w:rPr>
+              <w:t>34</w:t>
+            </w:r>
+          </w:p>
+        </w:tc>
+        <w:tc>
+          <w:tcPr>
+            <w:tcW w:type="dxa" w:w="1008"/>
+          </w:tcPr>
+          <w:p>
+            <w:r>
+              <w:rPr>
+                <w:sz w:val="17"/>
+              </w:rPr>
+              <w:t>B</w:t>
+            </w:r>
+          </w:p>
+        </w:tc>
+        <w:tc>
+          <w:tcPr>
+            <w:tcW w:type="dxa" w:w="1008"/>
+          </w:tcPr>
+          <w:p>
+            <w:r>
+              <w:rPr>
+                <w:b/>
+                <w:color w:val="F4B400"/>
+                <w:sz w:val="17"/>
+              </w:rPr>
+              <w:t>WAIT</w:t>
+            </w:r>
+          </w:p>
+        </w:tc>
+        <w:tc>
+          <w:tcPr>
+            <w:tcW w:type="dxa" w:w="1008"/>
+          </w:tcPr>
+          <w:p>
+            <w:r>
+              <w:rPr>
+                <w:sz w:val="17"/>
+              </w:rPr>
+              <w:t>18.1x</w:t>
+            </w:r>
+          </w:p>
+        </w:tc>
+        <w:tc>
+          <w:tcPr>
+            <w:tcW w:type="dxa" w:w="1008"/>
+          </w:tcPr>
+          <w:p>
+            <w:r>
+              <w:rPr>
+                <w:sz w:val="17"/>
+              </w:rPr>
+              <w:t>$1.08</w:t>
+            </w:r>
+          </w:p>
+        </w:tc>
+        <w:tc>
+          <w:tcPr>
+            <w:tcW w:type="dxa" w:w="1008"/>
+          </w:tcPr>
+          <w:p>
+            <w:r>
+              <w:rPr>
+                <w:sz w:val="17"/>
+              </w:rPr>
+              <w:t>+29.0%</w:t>
+            </w:r>
+          </w:p>
+        </w:tc>
+        <w:tc>
+          <w:tcPr>
+            <w:tcW w:type="dxa" w:w="1008"/>
+          </w:tcPr>
+          <w:p>
+            <w:r>
+              <w:rPr>
+                <w:sz w:val="17"/>
+              </w:rPr>
+              <w:t>+15.8%</w:t>
+            </w:r>
+          </w:p>
+        </w:tc>
+        <w:tc>
+          <w:tcPr>
+            <w:tcW w:type="dxa" w:w="1008"/>
+          </w:tcPr>
+          <w:p>
+            <w:r>
+              <w:rPr>
+                <w:sz w:val="17"/>
+              </w:rPr>
+              <w:t>1.8M</w:t>
+            </w:r>
+          </w:p>
+        </w:tc>
+        <w:tc>
+          <w:tcPr>
+            <w:tcW w:type="dxa" w:w="1008"/>
+          </w:tcPr>
+          <w:p>
+            <w:r>
+              <w:rPr>
+                <w:sz w:val="17"/>
+              </w:rPr>
+              <w:t>—</w:t>
+            </w:r>
+          </w:p>
+        </w:tc>
+      </w:tr>
+      <w:tr>
+        <w:tc>
+          <w:tcPr>
+            <w:tcW w:type="dxa" w:w="1008"/>
+          </w:tcPr>
+          <w:p>
+            <w:r>
+              <w:rPr>
+                <w:sz w:val="17"/>
+              </w:rPr>
+              <w:t>AKAN</w:t>
+            </w:r>
+          </w:p>
+        </w:tc>
+        <w:tc>
+          <w:tcPr>
+            <w:tcW w:type="dxa" w:w="1008"/>
+          </w:tcPr>
+          <w:p>
+            <w:r>
+              <w:rPr>
+                <w:sz w:val="17"/>
+              </w:rPr>
+              <w:t>33</w:t>
+            </w:r>
+          </w:p>
+        </w:tc>
+        <w:tc>
+          <w:tcPr>
+            <w:tcW w:type="dxa" w:w="1008"/>
+          </w:tcPr>
+          <w:p>
+            <w:r>
+              <w:rPr>
+                <w:sz w:val="17"/>
+              </w:rPr>
+              <w:t>B</w:t>
+            </w:r>
+          </w:p>
+        </w:tc>
+        <w:tc>
+          <w:tcPr>
+            <w:tcW w:type="dxa" w:w="1008"/>
+          </w:tcPr>
+          <w:p>
+            <w:r>
+              <w:rPr>
+                <w:b/>
+                <w:color w:val="F4B400"/>
+                <w:sz w:val="17"/>
+              </w:rPr>
+              <w:t>WAIT</w:t>
+            </w:r>
+          </w:p>
+        </w:tc>
+        <w:tc>
+          <w:tcPr>
+            <w:tcW w:type="dxa" w:w="1008"/>
+          </w:tcPr>
+          <w:p>
+            <w:r>
+              <w:rPr>
+                <w:sz w:val="17"/>
+              </w:rPr>
+              <w:t>37.2x</w:t>
+            </w:r>
+          </w:p>
+        </w:tc>
+        <w:tc>
+          <w:tcPr>
+            <w:tcW w:type="dxa" w:w="1008"/>
+          </w:tcPr>
+          <w:p>
+            <w:r>
+              <w:rPr>
+                <w:sz w:val="17"/>
+              </w:rPr>
+              <w:t>$20.45</w:t>
+            </w:r>
+          </w:p>
+        </w:tc>
+        <w:tc>
+          <w:tcPr>
+            <w:tcW w:type="dxa" w:w="1008"/>
+          </w:tcPr>
+          <w:p>
+            <w:r>
+              <w:rPr>
+                <w:sz w:val="17"/>
+              </w:rPr>
+              <w:t>+16.9%</w:t>
+            </w:r>
+          </w:p>
+        </w:tc>
+        <w:tc>
+          <w:tcPr>
+            <w:tcW w:type="dxa" w:w="1008"/>
+          </w:tcPr>
+          <w:p>
+            <w:r>
+              <w:rPr>
+                <w:sz w:val="17"/>
+              </w:rPr>
+              <w:t>+8.3%</w:t>
+            </w:r>
+          </w:p>
+        </w:tc>
+        <w:tc>
+          <w:tcPr>
+            <w:tcW w:type="dxa" w:w="1008"/>
+          </w:tcPr>
+          <w:p>
+            <w:r>
+              <w:rPr>
+                <w:sz w:val="17"/>
+              </w:rPr>
+              <w:t>0.5M</w:t>
+            </w:r>
+          </w:p>
+        </w:tc>
+        <w:tc>
+          <w:tcPr>
+            <w:tcW w:type="dxa" w:w="1008"/>
+          </w:tcPr>
+          <w:p>
+            <w:r>
+              <w:rPr>
+                <w:sz w:val="17"/>
+              </w:rPr>
+              <w:t>Here are the top movers in Tuesday's session.</w:t>
+            </w:r>
+          </w:p>
+        </w:tc>
+      </w:tr>
+      <w:tr>
+        <w:tc>
+          <w:tcPr>
+            <w:tcW w:type="dxa" w:w="1008"/>
+          </w:tcPr>
+          <w:p>
+            <w:r>
+              <w:rPr>
+                <w:sz w:val="17"/>
+              </w:rPr>
+              <w:t>WALD</w:t>
+            </w:r>
+          </w:p>
+        </w:tc>
+        <w:tc>
+          <w:tcPr>
+            <w:tcW w:type="dxa" w:w="1008"/>
+          </w:tcPr>
+          <w:p>
+            <w:r>
+              <w:rPr>
+                <w:sz w:val="17"/>
+              </w:rPr>
+              <w:t>33</w:t>
+            </w:r>
+          </w:p>
+        </w:tc>
+        <w:tc>
+          <w:tcPr>
+            <w:tcW w:type="dxa" w:w="1008"/>
+          </w:tcPr>
+          <w:p>
+            <w:r>
+              <w:rPr>
+                <w:sz w:val="17"/>
+              </w:rPr>
+              <w:t>B</w:t>
+            </w:r>
+          </w:p>
+        </w:tc>
+        <w:tc>
+          <w:tcPr>
+            <w:tcW w:type="dxa" w:w="1008"/>
+          </w:tcPr>
+          <w:p>
+            <w:r>
+              <w:rPr>
+                <w:b/>
+                <w:color w:val="F4B400"/>
+                <w:sz w:val="17"/>
+              </w:rPr>
+              <w:t>WAIT</w:t>
+            </w:r>
+          </w:p>
+        </w:tc>
+        <w:tc>
+          <w:tcPr>
+            <w:tcW w:type="dxa" w:w="1008"/>
+          </w:tcPr>
+          <w:p>
+            <w:r>
+              <w:rPr>
+                <w:sz w:val="17"/>
+              </w:rPr>
+              <w:t>10.1x</w:t>
+            </w:r>
+          </w:p>
+        </w:tc>
+        <w:tc>
+          <w:tcPr>
+            <w:tcW w:type="dxa" w:w="1008"/>
+          </w:tcPr>
+          <w:p>
+            <w:r>
+              <w:rPr>
+                <w:sz w:val="17"/>
+              </w:rPr>
+              <w:t>$1.04</w:t>
+            </w:r>
+          </w:p>
+        </w:tc>
+        <w:tc>
+          <w:tcPr>
+            <w:tcW w:type="dxa" w:w="1008"/>
+          </w:tcPr>
+          <w:p>
+            <w:r>
+              <w:rPr>
+                <w:sz w:val="17"/>
+              </w:rPr>
+              <w:t>+33.4%</w:t>
+            </w:r>
+          </w:p>
+        </w:tc>
+        <w:tc>
+          <w:tcPr>
+            <w:tcW w:type="dxa" w:w="1008"/>
+          </w:tcPr>
+          <w:p>
+            <w:r>
+              <w:rPr>
+                <w:sz w:val="17"/>
+              </w:rPr>
+              <w:t>+64.2%</w:t>
+            </w:r>
+          </w:p>
+        </w:tc>
+        <w:tc>
+          <w:tcPr>
+            <w:tcW w:type="dxa" w:w="1008"/>
+          </w:tcPr>
+          <w:p>
+            <w:r>
+              <w:rPr>
+                <w:sz w:val="17"/>
+              </w:rPr>
+              <w:t>47.1M</w:t>
+            </w:r>
+          </w:p>
+        </w:tc>
+        <w:tc>
+          <w:tcPr>
+            <w:tcW w:type="dxa" w:w="1008"/>
+          </w:tcPr>
+          <w:p>
+            <w:r>
+              <w:rPr>
+                <w:sz w:val="17"/>
+              </w:rPr>
+              <w:t>Waldencast announces conclusion of SEC investigati</w:t>
+            </w:r>
+          </w:p>
+        </w:tc>
+      </w:tr>
+      <w:tr>
+        <w:tc>
+          <w:tcPr>
+            <w:tcW w:type="dxa" w:w="1008"/>
+          </w:tcPr>
+          <w:p>
+            <w:r>
+              <w:rPr>
+                <w:sz w:val="17"/>
+              </w:rPr>
+              <w:t>TRAW</w:t>
+            </w:r>
+          </w:p>
+        </w:tc>
+        <w:tc>
+          <w:tcPr>
+            <w:tcW w:type="dxa" w:w="1008"/>
+          </w:tcPr>
+          <w:p>
+            <w:r>
+              <w:rPr>
+                <w:sz w:val="17"/>
+              </w:rPr>
+              <w:t>29</w:t>
+            </w:r>
+          </w:p>
+        </w:tc>
+        <w:tc>
+          <w:tcPr>
+            <w:tcW w:type="dxa" w:w="1008"/>
+          </w:tcPr>
+          <w:p>
+            <w:r>
+              <w:rPr>
+                <w:sz w:val="17"/>
+              </w:rPr>
+              <w:t>C</w:t>
+            </w:r>
+          </w:p>
+        </w:tc>
+        <w:tc>
+          <w:tcPr>
+            <w:tcW w:type="dxa" w:w="1008"/>
+          </w:tcPr>
+          <w:p>
+            <w:r>
+              <w:rPr>
+                <w:b/>
+                <w:color w:val="DB4437"/>
+                <w:sz w:val="17"/>
+              </w:rPr>
+              <w:t>AVOID</w:t>
+            </w:r>
+          </w:p>
+        </w:tc>
+        <w:tc>
+          <w:tcPr>
+            <w:tcW w:type="dxa" w:w="1008"/>
+          </w:tcPr>
+          <w:p>
+            <w:r>
+              <w:rPr>
+                <w:sz w:val="17"/>
+              </w:rPr>
+              <w:t>12.9x</w:t>
+            </w:r>
+          </w:p>
+        </w:tc>
+        <w:tc>
+          <w:tcPr>
+            <w:tcW w:type="dxa" w:w="1008"/>
+          </w:tcPr>
+          <w:p>
+            <w:r>
+              <w:rPr>
+                <w:sz w:val="17"/>
+              </w:rPr>
+              <w:t>$1.38</w:t>
+            </w:r>
+          </w:p>
+        </w:tc>
+        <w:tc>
+          <w:tcPr>
+            <w:tcW w:type="dxa" w:w="1008"/>
+          </w:tcPr>
+          <w:p>
+            <w:r>
+              <w:rPr>
+                <w:sz w:val="17"/>
+              </w:rPr>
+              <w:t>+14.1%</w:t>
+            </w:r>
+          </w:p>
+        </w:tc>
+        <w:tc>
+          <w:tcPr>
+            <w:tcW w:type="dxa" w:w="1008"/>
+          </w:tcPr>
+          <w:p>
+            <w:r>
+              <w:rPr>
+                <w:sz w:val="17"/>
+              </w:rPr>
+              <w:t>+5.8%</w:t>
+            </w:r>
+          </w:p>
+        </w:tc>
+        <w:tc>
+          <w:tcPr>
+            <w:tcW w:type="dxa" w:w="1008"/>
+          </w:tcPr>
+          <w:p>
+            <w:r>
+              <w:rPr>
+                <w:sz w:val="17"/>
+              </w:rPr>
+              <w:t>7.7M</w:t>
+            </w:r>
+          </w:p>
+        </w:tc>
+        <w:tc>
+          <w:tcPr>
+            <w:tcW w:type="dxa" w:w="1008"/>
+          </w:tcPr>
+          <w:p>
+            <w:r>
+              <w:rPr>
+                <w:sz w:val="17"/>
+              </w:rPr>
+              <w:t>—</w:t>
+            </w:r>
+          </w:p>
+        </w:tc>
+      </w:tr>
     </w:tbl>
     <w:p/>
     <w:p>
@@ -521,9 +1397,452 @@
         <w:pStyle w:val="Heading2"/>
       </w:pPr>
       <w:r>
-        <w:t>GO-Tier Picks — Top 0</w:t>
+        <w:t>GO-Tier Picks — Top 1</w:t>
       </w:r>
       <w:bookmarkEnd w:id="5"/>
+    </w:p>
+    <w:p>
+      <w:pPr>
+        <w:spacing w:after="20"/>
+      </w:pPr>
+      <w:r>
+        <w:t xml:space="preserve">  → </w:t>
+      </w:r>
+      <w:hyperlink w:anchor="ticker_KALV">
+        <w:r>
+          <w:rPr>
+            <w:rStyle w:val="Hyperlink"/>
+          </w:rPr>
+          <w:t xml:space="preserve">KALV</w:t>
+        </w:r>
+      </w:hyperlink>
+    </w:p>
+    <w:p>
+      <w:bookmarkStart w:id="100" w:name="ticker_KALV"/>
+      <w:pPr>
+        <w:pStyle w:val="Heading3"/>
+      </w:pPr>
+      <w:r>
+        <w:t>KALV  ·  KalVista Pharmaceuticals Inc</w:t>
+      </w:r>
+      <w:bookmarkEnd w:id="100"/>
+    </w:p>
+    <w:p>
+      <w:r>
+        <w:rPr>
+          <w:sz w:val="20"/>
+        </w:rPr>
+        <w:t xml:space="preserve">Score: 42/50  ·  Grade: A  ·  </w:t>
+      </w:r>
+      <w:r>
+        <w:rPr>
+          <w:b/>
+          <w:color w:val="0F9D58"/>
+          <w:sz w:val="20"/>
+        </w:rPr>
+        <w:t>[ GO ]</w:t>
+      </w:r>
+    </w:p>
+    <w:p>
+      <w:r>
+        <w:rPr>
+          <w:rFonts w:ascii="Courier New" w:hAnsi="Courier New"/>
+          <w:sz w:val="18"/>
+        </w:rPr>
+        <w:t>●●●●●●●●●●●●●○○  8/9 criteria</w:t>
+      </w:r>
+    </w:p>
+    <w:tbl>
+      <w:tblPr>
+        <w:tblStyle w:val="TableGrid"/>
+        <w:tblW w:type="auto" w:w="0"/>
+        <w:tblLook w:firstColumn="1" w:firstRow="1" w:lastColumn="0" w:lastRow="0" w:noHBand="0" w:noVBand="1" w:val="04A0"/>
+      </w:tblPr>
+      <w:tblGrid>
+        <w:gridCol w:w="1680"/>
+        <w:gridCol w:w="1680"/>
+        <w:gridCol w:w="1680"/>
+        <w:gridCol w:w="1680"/>
+        <w:gridCol w:w="1680"/>
+        <w:gridCol w:w="1680"/>
+      </w:tblGrid>
+      <w:tr>
+        <w:tc>
+          <w:tcPr>
+            <w:tcW w:type="dxa" w:w="1680"/>
+            <w:shd w:val="clear" w:color="auto" w:fill="2C2C44"/>
+          </w:tcPr>
+          <w:p>
+            <w:r>
+              <w:rPr>
+                <w:b/>
+                <w:color w:val="9A9AB0"/>
+                <w:sz w:val="16"/>
+              </w:rPr>
+              <w:t>Price</w:t>
+            </w:r>
+          </w:p>
+        </w:tc>
+        <w:tc>
+          <w:tcPr>
+            <w:tcW w:type="dxa" w:w="1680"/>
+            <w:shd w:val="clear" w:color="auto" w:fill="2C2C44"/>
+          </w:tcPr>
+          <w:p>
+            <w:r>
+              <w:rPr>
+                <w:b/>
+                <w:color w:val="9A9AB0"/>
+                <w:sz w:val="16"/>
+              </w:rPr>
+              <w:t>Change%</w:t>
+            </w:r>
+          </w:p>
+        </w:tc>
+        <w:tc>
+          <w:tcPr>
+            <w:tcW w:type="dxa" w:w="1680"/>
+            <w:shd w:val="clear" w:color="auto" w:fill="2C2C44"/>
+          </w:tcPr>
+          <w:p>
+            <w:r>
+              <w:rPr>
+                <w:b/>
+                <w:color w:val="9A9AB0"/>
+                <w:sz w:val="16"/>
+              </w:rPr>
+              <w:t>Gap%</w:t>
+            </w:r>
+          </w:p>
+        </w:tc>
+        <w:tc>
+          <w:tcPr>
+            <w:tcW w:type="dxa" w:w="1680"/>
+            <w:shd w:val="clear" w:color="auto" w:fill="2C2C44"/>
+          </w:tcPr>
+          <w:p>
+            <w:r>
+              <w:rPr>
+                <w:b/>
+                <w:color w:val="9A9AB0"/>
+                <w:sz w:val="16"/>
+              </w:rPr>
+              <w:t>RVOL</w:t>
+            </w:r>
+          </w:p>
+        </w:tc>
+        <w:tc>
+          <w:tcPr>
+            <w:tcW w:type="dxa" w:w="1680"/>
+            <w:shd w:val="clear" w:color="auto" w:fill="2C2C44"/>
+          </w:tcPr>
+          <w:p>
+            <w:r>
+              <w:rPr>
+                <w:b/>
+                <w:color w:val="9A9AB0"/>
+                <w:sz w:val="16"/>
+              </w:rPr>
+              <w:t>Float M</w:t>
+            </w:r>
+          </w:p>
+        </w:tc>
+        <w:tc>
+          <w:tcPr>
+            <w:tcW w:type="dxa" w:w="1680"/>
+            <w:shd w:val="clear" w:color="auto" w:fill="2C2C44"/>
+          </w:tcPr>
+          <w:p>
+            <w:r>
+              <w:rPr>
+                <w:b/>
+                <w:color w:val="9A9AB0"/>
+                <w:sz w:val="16"/>
+              </w:rPr>
+              <w:t>Volume</w:t>
+            </w:r>
+          </w:p>
+        </w:tc>
+      </w:tr>
+      <w:tr>
+        <w:tc>
+          <w:tcPr>
+            <w:tcW w:type="dxa" w:w="1680"/>
+          </w:tcPr>
+          <w:p>
+            <w:r>
+              <w:rPr>
+                <w:b/>
+                <w:sz w:val="18"/>
+              </w:rPr>
+              <w:t>$26.71</w:t>
+            </w:r>
+          </w:p>
+        </w:tc>
+        <w:tc>
+          <w:tcPr>
+            <w:tcW w:type="dxa" w:w="1680"/>
+          </w:tcPr>
+          <w:p>
+            <w:r>
+              <w:rPr>
+                <w:b/>
+                <w:sz w:val="18"/>
+              </w:rPr>
+              <w:t>+38.8%</w:t>
+            </w:r>
+          </w:p>
+        </w:tc>
+        <w:tc>
+          <w:tcPr>
+            <w:tcW w:type="dxa" w:w="1680"/>
+          </w:tcPr>
+          <w:p>
+            <w:r>
+              <w:rPr>
+                <w:b/>
+                <w:sz w:val="18"/>
+              </w:rPr>
+              <w:t>+38.1%</w:t>
+            </w:r>
+          </w:p>
+        </w:tc>
+        <w:tc>
+          <w:tcPr>
+            <w:tcW w:type="dxa" w:w="1680"/>
+          </w:tcPr>
+          <w:p>
+            <w:r>
+              <w:rPr>
+                <w:b/>
+                <w:sz w:val="18"/>
+              </w:rPr>
+              <w:t>6.4x</w:t>
+            </w:r>
+          </w:p>
+        </w:tc>
+        <w:tc>
+          <w:tcPr>
+            <w:tcW w:type="dxa" w:w="1680"/>
+          </w:tcPr>
+          <w:p>
+            <w:r>
+              <w:rPr>
+                <w:b/>
+                <w:sz w:val="18"/>
+              </w:rPr>
+              <w:t>37.9M</w:t>
+            </w:r>
+          </w:p>
+        </w:tc>
+        <w:tc>
+          <w:tcPr>
+            <w:tcW w:type="dxa" w:w="1680"/>
+          </w:tcPr>
+          <w:p>
+            <w:r>
+              <w:rPr>
+                <w:b/>
+                <w:sz w:val="18"/>
+              </w:rPr>
+              <w:t>22,629,327</w:t>
+            </w:r>
+          </w:p>
+        </w:tc>
+      </w:tr>
+    </w:tbl>
+    <w:p/>
+    <w:p>
+      <w:r>
+        <w:rPr>
+          <w:rFonts w:ascii="Courier New" w:hAnsi="Courier New"/>
+          <w:sz w:val="17"/>
+        </w:rPr>
+        <w:t xml:space="preserve">  Catalyst          ████████████ 15/15</w:t>
+      </w:r>
+    </w:p>
+    <w:p>
+      <w:r>
+        <w:rPr>
+          <w:rFonts w:ascii="Courier New" w:hAnsi="Courier New"/>
+          <w:sz w:val="17"/>
+        </w:rPr>
+        <w:t xml:space="preserve">  RVOL              ██████████░░ 10/12</w:t>
+      </w:r>
+    </w:p>
+    <w:p>
+      <w:r>
+        <w:rPr>
+          <w:rFonts w:ascii="Courier New" w:hAnsi="Courier New"/>
+          <w:sz w:val="17"/>
+        </w:rPr>
+        <w:t xml:space="preserve">  Price Action      ████████████ 10/10</w:t>
+      </w:r>
+    </w:p>
+    <w:p>
+      <w:r>
+        <w:rPr>
+          <w:rFonts w:ascii="Courier New" w:hAnsi="Courier New"/>
+          <w:sz w:val="17"/>
+        </w:rPr>
+        <w:t xml:space="preserve">  Float             ██████░░░░░░ 4/8</w:t>
+      </w:r>
+    </w:p>
+    <w:p>
+      <w:r>
+        <w:rPr>
+          <w:rFonts w:ascii="Courier New" w:hAnsi="Courier New"/>
+          <w:sz w:val="17"/>
+        </w:rPr>
+        <w:t xml:space="preserve">  Price Range       █████░░░░░░░ 2/5</w:t>
+      </w:r>
+    </w:p>
+    <w:p>
+      <w:pPr>
+        <w:spacing w:before="0" w:after="0"/>
+      </w:pPr>
+      <w:r>
+        <w:rPr>
+          <w:sz w:val="18"/>
+        </w:rPr>
+        <w:t xml:space="preserve">  ✅  Has catalyst</w:t>
+      </w:r>
+    </w:p>
+    <w:p>
+      <w:pPr>
+        <w:spacing w:before="0" w:after="0"/>
+      </w:pPr>
+      <w:r>
+        <w:rPr>
+          <w:sz w:val="18"/>
+        </w:rPr>
+        <w:t xml:space="preserve">  ⬜  High-impact catalyst</w:t>
+      </w:r>
+    </w:p>
+    <w:p>
+      <w:pPr>
+        <w:spacing w:before="0" w:after="0"/>
+      </w:pPr>
+      <w:r>
+        <w:rPr>
+          <w:sz w:val="18"/>
+        </w:rPr>
+        <w:t xml:space="preserve">  ✅  Fresh catalyst (&lt;12h)</w:t>
+      </w:r>
+    </w:p>
+    <w:p>
+      <w:pPr>
+        <w:spacing w:before="0" w:after="0"/>
+      </w:pPr>
+      <w:r>
+        <w:rPr>
+          <w:sz w:val="18"/>
+        </w:rPr>
+        <w:t xml:space="preserve">  ✅  RVOL ≥ 3x</w:t>
+      </w:r>
+    </w:p>
+    <w:p>
+      <w:pPr>
+        <w:spacing w:before="0" w:after="0"/>
+      </w:pPr>
+      <w:r>
+        <w:rPr>
+          <w:sz w:val="18"/>
+        </w:rPr>
+        <w:t xml:space="preserve">  ✅  RVOL ≥ 5x</w:t>
+      </w:r>
+    </w:p>
+    <w:p>
+      <w:pPr>
+        <w:spacing w:before="0" w:after="0"/>
+      </w:pPr>
+      <w:r>
+        <w:rPr>
+          <w:sz w:val="18"/>
+        </w:rPr>
+        <w:t xml:space="preserve">  ✅  Float ≤ 50M</w:t>
+      </w:r>
+    </w:p>
+    <w:p>
+      <w:pPr>
+        <w:spacing w:before="0" w:after="0"/>
+      </w:pPr>
+      <w:r>
+        <w:rPr>
+          <w:sz w:val="18"/>
+        </w:rPr>
+        <w:t xml:space="preserve">  ✅  Price in range ($0.50–$30)</w:t>
+      </w:r>
+    </w:p>
+    <w:p>
+      <w:pPr>
+        <w:spacing w:before="0" w:after="0"/>
+      </w:pPr>
+      <w:r>
+        <w:rPr>
+          <w:sz w:val="18"/>
+        </w:rPr>
+        <w:t xml:space="preserve">  ✅  Gap ≥ 5%</w:t>
+      </w:r>
+    </w:p>
+    <w:p>
+      <w:pPr>
+        <w:spacing w:before="0" w:after="0"/>
+      </w:pPr>
+      <w:r>
+        <w:rPr>
+          <w:sz w:val="18"/>
+        </w:rPr>
+        <w:t xml:space="preserve">  ✅  Change ≥ 10%</w:t>
+      </w:r>
+    </w:p>
+    <w:p/>
+    <w:p>
+      <w:r>
+        <w:rPr>
+          <w:i/>
+          <w:sz w:val="19"/>
+        </w:rPr>
+        <w:t>**KALV Scalp Setup Brief**</w:t>
+        <w:br/>
+        <w:br/>
+        <w:t>KALV is gapping up 38% on momentum as a top premarket gainer with strong 6.39x relative volume, indicating institutional interest in this biotech name. Key risk is the large float at 38M shares which could create resistance on any profit-taking, making this more suitable for quick scalps than extended holds. Look for entries on pullbacks to VWAP or the gap fill around $19.25 for long setups, or wait for a clear break above $27 with volume confirmation. Watch the 9:45-10:00 AM window closely - if volume starts to dry up without follow-through buying, be ready to exit quickly as biotech momentum can reverse fast.</w:t>
+      </w:r>
+    </w:p>
+    <w:p/>
+    <w:p>
+      <w:r>
+        <w:rPr>
+          <w:b/>
+          <w:color w:val="1A73E8"/>
+          <w:sz w:val="18"/>
+        </w:rPr>
+        <w:t>🔥 Top Catalyst  ·  0.2h ago  ·  Yahoo Finance  ·  Low Impact</w:t>
+      </w:r>
+    </w:p>
+    <w:p>
+      <w:r>
+        <w:rPr>
+          <w:sz w:val="19"/>
+        </w:rPr>
+        <w:t>Top Premarket Gainers</w:t>
+      </w:r>
+    </w:p>
+    <w:p>
+      <w:r>
+        <w:rPr>
+          <w:color w:val="1A73E8"/>
+          <w:sz w:val="16"/>
+        </w:rPr>
+        <w:t>https://finance.yahoo.com/markets/stocks/articles/top-premarket-gainers-120330914.html</w:t>
+      </w:r>
+    </w:p>
+    <w:p>
+      <w:pPr>
+        <w:pBdr>
+          <w:bottom w:val="single" w:sz="4" w:space="1" w:color="1A73E8"/>
+        </w:pBdr>
+      </w:pPr>
     </w:p>
     <w:p>
       <w:bookmarkStart w:id="6" w:name="cat_tape"/>
@@ -534,6 +1853,258 @@
         <w:t>Catalyst Tape</w:t>
       </w:r>
       <w:bookmarkEnd w:id="6"/>
+    </w:p>
+    <w:p>
+      <w:r>
+        <w:rPr>
+          <w:b/>
+        </w:rPr>
+        <w:t>KALV  ·  KalVista Pharmaceuticals Inc</w:t>
+      </w:r>
+    </w:p>
+    <w:p>
+      <w:pPr>
+        <w:spacing w:after="20"/>
+      </w:pPr>
+      <w:r>
+        <w:rPr>
+          <w:sz w:val="17"/>
+        </w:rPr>
+        <w:t xml:space="preserve">  [Low Impact  0.2h  Yahoo Finance]  Top Premarket Gainers</w:t>
+      </w:r>
+    </w:p>
+    <w:p>
+      <w:pPr>
+        <w:spacing w:after="20"/>
+      </w:pPr>
+      <w:r>
+        <w:rPr>
+          <w:sz w:val="17"/>
+        </w:rPr>
+        <w:t xml:space="preserve">  [Low Impact  0.3h  Yahoo Finance]  KalVista Pharmaceuticals to Be Acquired by Chiesi Group for $1.9 Billion</w:t>
+      </w:r>
+    </w:p>
+    <w:p>
+      <w:pPr>
+        <w:spacing w:after="20"/>
+      </w:pPr>
+      <w:r>
+        <w:rPr>
+          <w:sz w:val="17"/>
+        </w:rPr>
+        <w:t xml:space="preserve">  [Low Impact  0.5h  Yahoo Finance]  Chiesi Group to Acquire KalVista Pharmaceuticals, Expanding its Global Rare Disease Portfolio</w:t>
+      </w:r>
+    </w:p>
+    <w:p>
+      <w:pPr>
+        <w:spacing w:after="20"/>
+      </w:pPr>
+      <w:r>
+        <w:rPr>
+          <w:sz w:val="17"/>
+        </w:rPr>
+        <w:t xml:space="preserve">  [Low Impact  4.2h  Finnhub]  Italian drugmaker Chiesi to buy KalVista for $1.9 billion</w:t>
+      </w:r>
+    </w:p>
+    <w:p>
+      <w:pPr>
+        <w:spacing w:after="20"/>
+      </w:pPr>
+      <w:r>
+        <w:rPr>
+          <w:sz w:val="17"/>
+        </w:rPr>
+        <w:t xml:space="preserve">  [Low Impact  4.6h  Finnhub]  KalVista Pharmaceuticals : Chiesi Group to Acquire KalVista Pharmaceuticals, Expanding its Global Rare Disease Portfolio</w:t>
+      </w:r>
+    </w:p>
+    <w:p>
+      <w:r>
+        <w:rPr>
+          <w:b/>
+        </w:rPr>
+        <w:t>ATLN  ·  Atlantic International Corp</w:t>
+      </w:r>
+    </w:p>
+    <w:p>
+      <w:pPr>
+        <w:spacing w:after="20"/>
+      </w:pPr>
+      <w:r>
+        <w:rPr>
+          <w:sz w:val="17"/>
+        </w:rPr>
+        <w:t xml:space="preserve">  [Low Impact  15.2h  ChartMill]  Get insights into the top gainers and losers of Tuesday's after-hours session.</w:t>
+      </w:r>
+    </w:p>
+    <w:p>
+      <w:pPr>
+        <w:spacing w:after="20"/>
+      </w:pPr>
+      <w:r>
+        <w:rPr>
+          <w:sz w:val="17"/>
+        </w:rPr>
+        <w:t xml:space="preserve">  [Low Impact  17.2h  ChartMill]  Here are the top movers in Tuesday's session.</w:t>
+      </w:r>
+    </w:p>
+    <w:p>
+      <w:pPr>
+        <w:spacing w:after="20"/>
+      </w:pPr>
+      <w:r>
+        <w:rPr>
+          <w:sz w:val="17"/>
+        </w:rPr>
+        <w:t xml:space="preserve">  [Low Impact  19.1h  Benzinga]  12 Health Care Stocks Moving In Tuesday's After-Market Session</w:t>
+      </w:r>
+    </w:p>
+    <w:p>
+      <w:pPr>
+        <w:spacing w:after="20"/>
+      </w:pPr>
+      <w:r>
+        <w:rPr>
+          <w:sz w:val="17"/>
+        </w:rPr>
+        <w:t xml:space="preserve">  [Low Impact  23.1h  Benzinga]  12 Health Care Stocks Moving In Tuesday's Intraday Session</w:t>
+      </w:r>
+    </w:p>
+    <w:p>
+      <w:pPr>
+        <w:spacing w:after="20"/>
+      </w:pPr>
+      <w:r>
+        <w:rPr>
+          <w:sz w:val="17"/>
+        </w:rPr>
+        <w:t xml:space="preserve">  [Low Impact  28.1h  Benzinga]  Atlantic International Expands Its Global Technology And Workforce Revenue Platform Through Circle8 Group</w:t>
+      </w:r>
+    </w:p>
+    <w:p>
+      <w:pPr>
+        <w:spacing w:after="20"/>
+      </w:pPr>
+      <w:r>
+        <w:rPr>
+          <w:sz w:val="17"/>
+        </w:rPr>
+        <w:t xml:space="preserve">  [Low Impact  28.2h  Finnhub]  Atlantic International Expands its $1.2 Billion Revenue (Unaudited) Platform into AI, Cybersecurity, and Data Infrastructure Through Circle8</w:t>
+      </w:r>
+    </w:p>
+    <w:p>
+      <w:r>
+        <w:rPr>
+          <w:b/>
+        </w:rPr>
+        <w:t>AKAN  ·  Akanda Corp</w:t>
+      </w:r>
+    </w:p>
+    <w:p>
+      <w:pPr>
+        <w:spacing w:after="20"/>
+      </w:pPr>
+      <w:r>
+        <w:rPr>
+          <w:sz w:val="17"/>
+        </w:rPr>
+        <w:t xml:space="preserve">  [Low Impact  17.2h  ChartMill]  Here are the top movers in Tuesday's session.</w:t>
+      </w:r>
+    </w:p>
+    <w:p>
+      <w:pPr>
+        <w:spacing w:after="20"/>
+      </w:pPr>
+      <w:r>
+        <w:rPr>
+          <w:sz w:val="17"/>
+        </w:rPr>
+        <w:t xml:space="preserve">  [Low Impact  19.1h  Benzinga]  12 Health Care Stocks Moving In Tuesday's After-Market Session</w:t>
+      </w:r>
+    </w:p>
+    <w:p>
+      <w:pPr>
+        <w:spacing w:after="20"/>
+      </w:pPr>
+      <w:r>
+        <w:rPr>
+          <w:sz w:val="17"/>
+        </w:rPr>
+        <w:t xml:space="preserve">  [Low Impact  23.1h  Benzinga]  12 Health Care Stocks Moving In Tuesday's Intraday Session</w:t>
+      </w:r>
+    </w:p>
+    <w:p>
+      <w:pPr>
+        <w:spacing w:after="20"/>
+      </w:pPr>
+      <w:r>
+        <w:rPr>
+          <w:sz w:val="17"/>
+        </w:rPr>
+        <w:t xml:space="preserve">  [Low Impact  24.2h  Fontspace.com]  Melto Gofer by Cikareotype Studio</w:t>
+      </w:r>
+    </w:p>
+    <w:p>
+      <w:pPr>
+        <w:spacing w:after="20"/>
+      </w:pPr>
+      <w:r>
+        <w:rPr>
+          <w:sz w:val="17"/>
+        </w:rPr>
+        <w:t xml:space="preserve">  [Low Impact  27.2h  Fontspace.com]  Luroha by Gracetype Studio</w:t>
+      </w:r>
+    </w:p>
+    <w:p>
+      <w:pPr>
+        <w:spacing w:after="20"/>
+      </w:pPr>
+      <w:r>
+        <w:rPr>
+          <w:sz w:val="17"/>
+        </w:rPr>
+        <w:t xml:space="preserve">  [Low Impact  27.3h  Fontspace.com]  MONTRAVA by NTC Graphic</w:t>
+      </w:r>
+    </w:p>
+    <w:p>
+      <w:r>
+        <w:rPr>
+          <w:b/>
+        </w:rPr>
+        <w:t>WALD  ·  Waldencast plc</w:t>
+      </w:r>
+    </w:p>
+    <w:p>
+      <w:pPr>
+        <w:spacing w:after="20"/>
+      </w:pPr>
+      <w:r>
+        <w:rPr>
+          <w:sz w:val="17"/>
+        </w:rPr>
+        <w:t xml:space="preserve">  [High Impact  17.7h  Finnhub]  Waldencast announces conclusion of SEC investigation</w:t>
+      </w:r>
+    </w:p>
+    <w:p>
+      <w:pPr>
+        <w:spacing w:after="20"/>
+      </w:pPr>
+      <w:r>
+        <w:rPr>
+          <w:sz w:val="17"/>
+        </w:rPr>
+        <w:t xml:space="preserve">  [Low Impact  0.2h  Yahoo Finance]  Top Premarket Gainers</w:t>
+      </w:r>
+    </w:p>
+    <w:p>
+      <w:pPr>
+        <w:spacing w:after="20"/>
+      </w:pPr>
+      <w:r>
+        <w:rPr>
+          <w:sz w:val="17"/>
+        </w:rPr>
+        <w:t xml:space="preserve">  [Low Impact  70.3h  Pypi.org]  prism-de added to PyPI</w:t>
+      </w:r>
     </w:p>
     <w:p>
       <w:bookmarkStart w:id="7" w:name="tos_export"/>
@@ -547,7 +2118,7 @@
     </w:p>
     <w:p>
       <w:r>
-        <w:t>GO-tier symbols:  —</w:t>
+        <w:t>GO-tier symbols:  KALV</w:t>
       </w:r>
     </w:p>
     <w:p>

</xml_diff>